<commit_message>
Docs: Update DOCX to render Mermaid diagram as actual image
</commit_message>
<xml_diff>
--- a/MediKiosk_Project_Draft.docx
+++ b/MediKiosk_Project_Draft.docx
@@ -275,7 +275,7 @@
         <w:rPr>
           <w:i/>
         </w:rPr>
-        <w:t>--- Code / Diagram ---</w:t>
+        <w:t>--- Code Block ---</w:t>
       </w:r>
     </w:p>
     <w:p>
@@ -883,7 +883,7 @@
         <w:rPr>
           <w:i/>
         </w:rPr>
-        <w:t>--- End of Code Block ---</w:t>
+        <w:t>------------------</w:t>
       </w:r>
     </w:p>
     <w:p>
@@ -1498,500 +1498,75 @@
     </w:p>
     <w:p>
       <w:r>
+        <w:drawing>
+          <wp:inline xmlns:a="http://schemas.openxmlformats.org/drawingml/2006/main" xmlns:pic="http://schemas.openxmlformats.org/drawingml/2006/picture">
+            <wp:extent cx="5486400" cy="5545753"/>
+            <wp:docPr id="1" name="Picture 1"/>
+            <wp:cNvGraphicFramePr>
+              <a:graphicFrameLocks noChangeAspect="1"/>
+            </wp:cNvGraphicFramePr>
+            <a:graphic>
+              <a:graphicData uri="http://schemas.openxmlformats.org/drawingml/2006/picture">
+                <pic:pic>
+                  <pic:nvPicPr>
+                    <pic:cNvPr id="0" name="temp_mermaid.png"/>
+                    <pic:cNvPicPr/>
+                  </pic:nvPicPr>
+                  <pic:blipFill>
+                    <a:blip r:embed="rId9"/>
+                    <a:stretch>
+                      <a:fillRect/>
+                    </a:stretch>
+                  </pic:blipFill>
+                  <pic:spPr>
+                    <a:xfrm>
+                      <a:off x="0" y="0"/>
+                      <a:ext cx="5486400" cy="5545753"/>
+                    </a:xfrm>
+                    <a:prstGeom prst="rect"/>
+                  </pic:spPr>
+                </pic:pic>
+              </a:graphicData>
+            </a:graphic>
+          </wp:inline>
+        </w:drawing>
+      </w:r>
+    </w:p>
+    <w:p>
+      <w:pPr>
+        <w:pStyle w:val="Caption"/>
+      </w:pPr>
+      <w:r>
+        <w:t>Figure: Architecture Data Flow</w:t>
+      </w:r>
+    </w:p>
+    <w:p>
+      <w:r>
+        <w:br w:type="page"/>
+      </w:r>
+    </w:p>
+    <w:p>
+      <w:pPr>
+        <w:pStyle w:val="Heading2"/>
+      </w:pPr>
+      <w:r>
+        <w:t>5. AI Pipeline — Detailed</w:t>
+      </w:r>
+    </w:p>
+    <w:p>
+      <w:pPr>
+        <w:pStyle w:val="Heading3"/>
+      </w:pPr>
+      <w:r>
+        <w:t>5.1 Chat Pipeline (`/api/chat`)</w:t>
+      </w:r>
+    </w:p>
+    <w:p>
+      <w:r>
         <w:rPr>
           <w:i/>
         </w:rPr>
-        <w:t>--- Code / Diagram ---</w:t>
-      </w:r>
-    </w:p>
-    <w:p>
-      <w:pPr>
-        <w:pStyle w:val="NoSpacing"/>
-      </w:pPr>
-      <w:r>
-        <w:rPr>
-          <w:rFonts w:ascii="Courier New" w:hAnsi="Courier New"/>
-          <w:sz w:val="18"/>
-        </w:rPr>
-        <w:t>graph TD</w:t>
-      </w:r>
-    </w:p>
-    <w:p>
-      <w:pPr>
-        <w:pStyle w:val="NoSpacing"/>
-      </w:pPr>
-      <w:r>
-        <w:rPr>
-          <w:rFonts w:ascii="Courier New" w:hAnsi="Courier New"/>
-          <w:sz w:val="18"/>
-        </w:rPr>
-        <w:t xml:space="preserve">    %% Patient Kiosk Interactions</w:t>
-      </w:r>
-    </w:p>
-    <w:p>
-      <w:pPr>
-        <w:pStyle w:val="NoSpacing"/>
-      </w:pPr>
-      <w:r>
-        <w:rPr>
-          <w:rFonts w:ascii="Courier New" w:hAnsi="Courier New"/>
-          <w:sz w:val="18"/>
-        </w:rPr>
-        <w:t xml:space="preserve">    subgraph Kiosk UI</w:t>
-      </w:r>
-    </w:p>
-    <w:p>
-      <w:pPr>
-        <w:pStyle w:val="NoSpacing"/>
-      </w:pPr>
-      <w:r>
-        <w:rPr>
-          <w:rFonts w:ascii="Courier New" w:hAnsi="Courier New"/>
-          <w:sz w:val="18"/>
-        </w:rPr>
-        <w:t xml:space="preserve">        A[index.html&lt;br&gt;ABHA Auth] --&gt;|Start Session| B[chat.html&lt;br&gt;Conversational Interface]</w:t>
-      </w:r>
-    </w:p>
-    <w:p>
-      <w:pPr>
-        <w:pStyle w:val="NoSpacing"/>
-      </w:pPr>
-      <w:r>
-        <w:rPr>
-          <w:rFonts w:ascii="Courier New" w:hAnsi="Courier New"/>
-          <w:sz w:val="18"/>
-        </w:rPr>
-        <w:t xml:space="preserve">        B --&gt;|Speech-to-Text| STT(Web Speech API)</w:t>
-      </w:r>
-    </w:p>
-    <w:p>
-      <w:pPr>
-        <w:pStyle w:val="NoSpacing"/>
-      </w:pPr>
-      <w:r>
-        <w:rPr>
-          <w:rFonts w:ascii="Courier New" w:hAnsi="Courier New"/>
-          <w:sz w:val="18"/>
-        </w:rPr>
-        <w:t xml:space="preserve">        B --&gt;|Upload Doc| Cam(File/Camera Scan)</w:t>
-      </w:r>
-    </w:p>
-    <w:p>
-      <w:pPr>
-        <w:pStyle w:val="NoSpacing"/>
-      </w:pPr>
-      <w:r>
-        <w:rPr>
-          <w:rFonts w:ascii="Courier New" w:hAnsi="Courier New"/>
-          <w:sz w:val="18"/>
-        </w:rPr>
-        <w:t xml:space="preserve">    end</w:t>
-      </w:r>
-    </w:p>
-    <w:p>
-      <w:pPr>
-        <w:pStyle w:val="NoSpacing"/>
-      </w:pPr>
-      <w:r>
-        <w:rPr>
-          <w:rFonts w:ascii="Courier New" w:hAnsi="Courier New"/>
-          <w:sz w:val="18"/>
-        </w:rPr>
-      </w:r>
-    </w:p>
-    <w:p>
-      <w:pPr>
-        <w:pStyle w:val="NoSpacing"/>
-      </w:pPr>
-      <w:r>
-        <w:rPr>
-          <w:rFonts w:ascii="Courier New" w:hAnsi="Courier New"/>
-          <w:sz w:val="18"/>
-        </w:rPr>
-        <w:t xml:space="preserve">    %% Backend Services</w:t>
-      </w:r>
-    </w:p>
-    <w:p>
-      <w:pPr>
-        <w:pStyle w:val="NoSpacing"/>
-      </w:pPr>
-      <w:r>
-        <w:rPr>
-          <w:rFonts w:ascii="Courier New" w:hAnsi="Courier New"/>
-          <w:sz w:val="18"/>
-        </w:rPr>
-        <w:t xml:space="preserve">    subgraph FastAPI Backend</w:t>
-      </w:r>
-    </w:p>
-    <w:p>
-      <w:pPr>
-        <w:pStyle w:val="NoSpacing"/>
-      </w:pPr>
-      <w:r>
-        <w:rPr>
-          <w:rFonts w:ascii="Courier New" w:hAnsi="Courier New"/>
-          <w:sz w:val="18"/>
-        </w:rPr>
-        <w:t xml:space="preserve">        STT --&gt;|POST /api/chat| ChatE[Chat Endpoint]</w:t>
-      </w:r>
-    </w:p>
-    <w:p>
-      <w:pPr>
-        <w:pStyle w:val="NoSpacing"/>
-      </w:pPr>
-      <w:r>
-        <w:rPr>
-          <w:rFonts w:ascii="Courier New" w:hAnsi="Courier New"/>
-          <w:sz w:val="18"/>
-        </w:rPr>
-        <w:t xml:space="preserve">        Cam --&gt;|POST /api/scan_document| OCRE[OCR Endpoint]</w:t>
-      </w:r>
-    </w:p>
-    <w:p>
-      <w:pPr>
-        <w:pStyle w:val="NoSpacing"/>
-      </w:pPr>
-      <w:r>
-        <w:rPr>
-          <w:rFonts w:ascii="Courier New" w:hAnsi="Courier New"/>
-          <w:sz w:val="18"/>
-        </w:rPr>
-        <w:t xml:space="preserve">        </w:t>
-      </w:r>
-    </w:p>
-    <w:p>
-      <w:pPr>
-        <w:pStyle w:val="NoSpacing"/>
-      </w:pPr>
-      <w:r>
-        <w:rPr>
-          <w:rFonts w:ascii="Courier New" w:hAnsi="Courier New"/>
-          <w:sz w:val="18"/>
-        </w:rPr>
-        <w:t xml:space="preserve">        ChatE --&gt;|Inference| Groq((Groq API&lt;br&gt;Llama-3.1-8b))</w:t>
-      </w:r>
-    </w:p>
-    <w:p>
-      <w:pPr>
-        <w:pStyle w:val="NoSpacing"/>
-      </w:pPr>
-      <w:r>
-        <w:rPr>
-          <w:rFonts w:ascii="Courier New" w:hAnsi="Courier New"/>
-          <w:sz w:val="18"/>
-        </w:rPr>
-        <w:t xml:space="preserve">        Groq -.-&gt;|On Failure Fallback| Gemini((Gemini API&lt;br&gt;3.5-Flash-Lite))</w:t>
-      </w:r>
-    </w:p>
-    <w:p>
-      <w:pPr>
-        <w:pStyle w:val="NoSpacing"/>
-      </w:pPr>
-      <w:r>
-        <w:rPr>
-          <w:rFonts w:ascii="Courier New" w:hAnsi="Courier New"/>
-          <w:sz w:val="18"/>
-        </w:rPr>
-        <w:t xml:space="preserve">        OCRE --&gt;|Vision Task| Gemini</w:t>
-      </w:r>
-    </w:p>
-    <w:p>
-      <w:pPr>
-        <w:pStyle w:val="NoSpacing"/>
-      </w:pPr>
-      <w:r>
-        <w:rPr>
-          <w:rFonts w:ascii="Courier New" w:hAnsi="Courier New"/>
-          <w:sz w:val="18"/>
-        </w:rPr>
-        <w:t xml:space="preserve">        </w:t>
-      </w:r>
-    </w:p>
-    <w:p>
-      <w:pPr>
-        <w:pStyle w:val="NoSpacing"/>
-      </w:pPr>
-      <w:r>
-        <w:rPr>
-          <w:rFonts w:ascii="Courier New" w:hAnsi="Courier New"/>
-          <w:sz w:val="18"/>
-        </w:rPr>
-        <w:t xml:space="preserve">        ChatE --&gt;|Check Response| EFlag{"Has [EMERGENCY_FLAG]?"}</w:t>
-      </w:r>
-    </w:p>
-    <w:p>
-      <w:pPr>
-        <w:pStyle w:val="NoSpacing"/>
-      </w:pPr>
-      <w:r>
-        <w:rPr>
-          <w:rFonts w:ascii="Courier New" w:hAnsi="Courier New"/>
-          <w:sz w:val="18"/>
-        </w:rPr>
-        <w:t xml:space="preserve">        EFlag --&gt;|Yes| Siren[🚨 Instant UI Siren]</w:t>
-      </w:r>
-    </w:p>
-    <w:p>
-      <w:pPr>
-        <w:pStyle w:val="NoSpacing"/>
-      </w:pPr>
-      <w:r>
-        <w:rPr>
-          <w:rFonts w:ascii="Courier New" w:hAnsi="Courier New"/>
-          <w:sz w:val="18"/>
-        </w:rPr>
-        <w:t xml:space="preserve">        EFlag --&gt;|No| B</w:t>
-      </w:r>
-    </w:p>
-    <w:p>
-      <w:pPr>
-        <w:pStyle w:val="NoSpacing"/>
-      </w:pPr>
-      <w:r>
-        <w:rPr>
-          <w:rFonts w:ascii="Courier New" w:hAnsi="Courier New"/>
-          <w:sz w:val="18"/>
-        </w:rPr>
-        <w:t xml:space="preserve">    end</w:t>
-      </w:r>
-    </w:p>
-    <w:p>
-      <w:pPr>
-        <w:pStyle w:val="NoSpacing"/>
-      </w:pPr>
-      <w:r>
-        <w:rPr>
-          <w:rFonts w:ascii="Courier New" w:hAnsi="Courier New"/>
-          <w:sz w:val="18"/>
-        </w:rPr>
-      </w:r>
-    </w:p>
-    <w:p>
-      <w:pPr>
-        <w:pStyle w:val="NoSpacing"/>
-      </w:pPr>
-      <w:r>
-        <w:rPr>
-          <w:rFonts w:ascii="Courier New" w:hAnsi="Courier New"/>
-          <w:sz w:val="18"/>
-        </w:rPr>
-        <w:t xml:space="preserve">    %% Summary &amp; Triage Generation</w:t>
-      </w:r>
-    </w:p>
-    <w:p>
-      <w:pPr>
-        <w:pStyle w:val="NoSpacing"/>
-      </w:pPr>
-      <w:r>
-        <w:rPr>
-          <w:rFonts w:ascii="Courier New" w:hAnsi="Courier New"/>
-          <w:sz w:val="18"/>
-        </w:rPr>
-        <w:t xml:space="preserve">    subgraph Triage Engine</w:t>
-      </w:r>
-    </w:p>
-    <w:p>
-      <w:pPr>
-        <w:pStyle w:val="NoSpacing"/>
-      </w:pPr>
-      <w:r>
-        <w:rPr>
-          <w:rFonts w:ascii="Courier New" w:hAnsi="Courier New"/>
-          <w:sz w:val="18"/>
-        </w:rPr>
-        <w:t xml:space="preserve">        B --&gt;|Finish &amp; Send| SumE[POST /api/generate_summary]</w:t>
-      </w:r>
-    </w:p>
-    <w:p>
-      <w:pPr>
-        <w:pStyle w:val="NoSpacing"/>
-      </w:pPr>
-      <w:r>
-        <w:rPr>
-          <w:rFonts w:ascii="Courier New" w:hAnsi="Courier New"/>
-          <w:sz w:val="18"/>
-        </w:rPr>
-        <w:t xml:space="preserve">        SumE --&gt;|Transcript + OCR Context| Groq</w:t>
-      </w:r>
-    </w:p>
-    <w:p>
-      <w:pPr>
-        <w:pStyle w:val="NoSpacing"/>
-      </w:pPr>
-      <w:r>
-        <w:rPr>
-          <w:rFonts w:ascii="Courier New" w:hAnsi="Courier New"/>
-          <w:sz w:val="18"/>
-        </w:rPr>
-        <w:t xml:space="preserve">        SumE -.-&gt;|On Failure Fallback| Gemini</w:t>
-      </w:r>
-    </w:p>
-    <w:p>
-      <w:pPr>
-        <w:pStyle w:val="NoSpacing"/>
-      </w:pPr>
-      <w:r>
-        <w:rPr>
-          <w:rFonts w:ascii="Courier New" w:hAnsi="Courier New"/>
-          <w:sz w:val="18"/>
-        </w:rPr>
-        <w:t xml:space="preserve">        SumE --&gt;|Parse Result| Struct[Extract SOAP JSON, Assign Dept &amp; Priority]</w:t>
-      </w:r>
-    </w:p>
-    <w:p>
-      <w:pPr>
-        <w:pStyle w:val="NoSpacing"/>
-      </w:pPr>
-      <w:r>
-        <w:rPr>
-          <w:rFonts w:ascii="Courier New" w:hAnsi="Courier New"/>
-          <w:sz w:val="18"/>
-        </w:rPr>
-        <w:t xml:space="preserve">        Struct --&gt;|Save Token| DB[(session_data.json)]</w:t>
-      </w:r>
-    </w:p>
-    <w:p>
-      <w:pPr>
-        <w:pStyle w:val="NoSpacing"/>
-      </w:pPr>
-      <w:r>
-        <w:rPr>
-          <w:rFonts w:ascii="Courier New" w:hAnsi="Courier New"/>
-          <w:sz w:val="18"/>
-        </w:rPr>
-        <w:t xml:space="preserve">    end</w:t>
-      </w:r>
-    </w:p>
-    <w:p>
-      <w:pPr>
-        <w:pStyle w:val="NoSpacing"/>
-      </w:pPr>
-      <w:r>
-        <w:rPr>
-          <w:rFonts w:ascii="Courier New" w:hAnsi="Courier New"/>
-          <w:sz w:val="18"/>
-        </w:rPr>
-      </w:r>
-    </w:p>
-    <w:p>
-      <w:pPr>
-        <w:pStyle w:val="NoSpacing"/>
-      </w:pPr>
-      <w:r>
-        <w:rPr>
-          <w:rFonts w:ascii="Courier New" w:hAnsi="Courier New"/>
-          <w:sz w:val="18"/>
-        </w:rPr>
-        <w:t xml:space="preserve">    %% Synchronized Status &amp; Doctor Approval</w:t>
-      </w:r>
-    </w:p>
-    <w:p>
-      <w:pPr>
-        <w:pStyle w:val="NoSpacing"/>
-      </w:pPr>
-      <w:r>
-        <w:rPr>
-          <w:rFonts w:ascii="Courier New" w:hAnsi="Courier New"/>
-          <w:sz w:val="18"/>
-        </w:rPr>
-        <w:t xml:space="preserve">    subgraph Waiting &amp; Approval</w:t>
-      </w:r>
-    </w:p>
-    <w:p>
-      <w:pPr>
-        <w:pStyle w:val="NoSpacing"/>
-      </w:pPr>
-      <w:r>
-        <w:rPr>
-          <w:rFonts w:ascii="Courier New" w:hAnsi="Courier New"/>
-          <w:sz w:val="18"/>
-        </w:rPr>
-        <w:t xml:space="preserve">        DB --&gt;|Server-Sent Events| SSE[status.html&lt;br&gt;Live Patient Status]</w:t>
-      </w:r>
-    </w:p>
-    <w:p>
-      <w:pPr>
-        <w:pStyle w:val="NoSpacing"/>
-      </w:pPr>
-      <w:r>
-        <w:rPr>
-          <w:rFonts w:ascii="Courier New" w:hAnsi="Courier New"/>
-          <w:sz w:val="18"/>
-        </w:rPr>
-        <w:t xml:space="preserve">        DB --&gt;|GET /api/queue| Doc[doctor_panel.html&lt;br&gt;Doctor Queue]</w:t>
-      </w:r>
-    </w:p>
-    <w:p>
-      <w:pPr>
-        <w:pStyle w:val="NoSpacing"/>
-      </w:pPr>
-      <w:r>
-        <w:rPr>
-          <w:rFonts w:ascii="Courier New" w:hAnsi="Courier New"/>
-          <w:sz w:val="18"/>
-        </w:rPr>
-        <w:t xml:space="preserve">        Doc --&gt;|Review &amp; Approve| App[POST /api/approve]</w:t>
-      </w:r>
-    </w:p>
-    <w:p>
-      <w:pPr>
-        <w:pStyle w:val="NoSpacing"/>
-      </w:pPr>
-      <w:r>
-        <w:rPr>
-          <w:rFonts w:ascii="Courier New" w:hAnsi="Courier New"/>
-          <w:sz w:val="18"/>
-        </w:rPr>
-        <w:t xml:space="preserve">        App --&gt;|Update Record| DB</w:t>
-      </w:r>
-    </w:p>
-    <w:p>
-      <w:pPr>
-        <w:pStyle w:val="NoSpacing"/>
-      </w:pPr>
-      <w:r>
-        <w:rPr>
-          <w:rFonts w:ascii="Courier New" w:hAnsi="Courier New"/>
-          <w:sz w:val="18"/>
-        </w:rPr>
-        <w:t xml:space="preserve">    end</w:t>
-      </w:r>
-    </w:p>
-    <w:p>
-      <w:r>
-        <w:rPr>
-          <w:i/>
-        </w:rPr>
-        <w:t>--- End of Code Block ---</w:t>
-      </w:r>
-    </w:p>
-    <w:p>
-      <w:r>
-        <w:br w:type="page"/>
-      </w:r>
-    </w:p>
-    <w:p>
-      <w:pPr>
-        <w:pStyle w:val="Heading2"/>
-      </w:pPr>
-      <w:r>
-        <w:t>5. AI Pipeline — Detailed</w:t>
-      </w:r>
-    </w:p>
-    <w:p>
-      <w:pPr>
-        <w:pStyle w:val="Heading3"/>
-      </w:pPr>
-      <w:r>
-        <w:t>5.1 Chat Pipeline (`/api/chat`)</w:t>
-      </w:r>
-    </w:p>
-    <w:p>
-      <w:r>
-        <w:rPr>
-          <w:i/>
-        </w:rPr>
-        <w:t>--- Code / Diagram ---</w:t>
+        <w:t>--- Code Block ---</w:t>
       </w:r>
     </w:p>
     <w:p>
@@ -2299,7 +1874,7 @@
         <w:rPr>
           <w:i/>
         </w:rPr>
-        <w:t>--- End of Code Block ---</w:t>
+        <w:t>------------------</w:t>
       </w:r>
     </w:p>
     <w:p>
@@ -2315,7 +1890,7 @@
         <w:rPr>
           <w:i/>
         </w:rPr>
-        <w:t>--- Code / Diagram ---</w:t>
+        <w:t>--- Code Block ---</w:t>
       </w:r>
     </w:p>
     <w:p>
@@ -2623,7 +2198,7 @@
         <w:rPr>
           <w:i/>
         </w:rPr>
-        <w:t>--- End of Code Block ---</w:t>
+        <w:t>------------------</w:t>
       </w:r>
     </w:p>
     <w:p>
@@ -2639,7 +2214,7 @@
         <w:rPr>
           <w:i/>
         </w:rPr>
-        <w:t>--- Code / Diagram ---</w:t>
+        <w:t>--- Code Block ---</w:t>
       </w:r>
     </w:p>
     <w:p>
@@ -3247,7 +2822,7 @@
         <w:rPr>
           <w:i/>
         </w:rPr>
-        <w:t>--- End of Code Block ---</w:t>
+        <w:t>------------------</w:t>
       </w:r>
     </w:p>
     <w:p>
@@ -3263,7 +2838,7 @@
         <w:rPr>
           <w:i/>
         </w:rPr>
-        <w:t>--- Code / Diagram ---</w:t>
+        <w:t>--- Code Block ---</w:t>
       </w:r>
     </w:p>
     <w:p>
@@ -3535,7 +3110,7 @@
         <w:rPr>
           <w:i/>
         </w:rPr>
-        <w:t>--- End of Code Block ---</w:t>
+        <w:t>------------------</w:t>
       </w:r>
     </w:p>
     <w:p>
@@ -3551,7 +3126,7 @@
         <w:rPr>
           <w:i/>
         </w:rPr>
-        <w:t>--- Code / Diagram ---</w:t>
+        <w:t>--- Code Block ---</w:t>
       </w:r>
     </w:p>
     <w:p>
@@ -3667,7 +3242,7 @@
         <w:rPr>
           <w:i/>
         </w:rPr>
-        <w:t>--- End of Code Block ---</w:t>
+        <w:t>------------------</w:t>
       </w:r>
     </w:p>
     <w:p>
@@ -3701,7 +3276,7 @@
         <w:rPr>
           <w:i/>
         </w:rPr>
-        <w:t>--- Code / Diagram ---</w:t>
+        <w:t>--- Code Block ---</w:t>
       </w:r>
     </w:p>
     <w:p>
@@ -3769,7 +3344,7 @@
         <w:rPr>
           <w:i/>
         </w:rPr>
-        <w:t>--- End of Code Block ---</w:t>
+        <w:t>------------------</w:t>
       </w:r>
     </w:p>
     <w:p>
@@ -4135,7 +3710,7 @@
         <w:rPr>
           <w:i/>
         </w:rPr>
-        <w:t>--- Code / Diagram ---</w:t>
+        <w:t>--- Code Block ---</w:t>
       </w:r>
     </w:p>
     <w:p>
@@ -4407,7 +3982,7 @@
         <w:rPr>
           <w:i/>
         </w:rPr>
-        <w:t>--- End of Code Block ---</w:t>
+        <w:t>------------------</w:t>
       </w:r>
     </w:p>
     <w:p>
@@ -4423,7 +3998,7 @@
         <w:rPr>
           <w:i/>
         </w:rPr>
-        <w:t>--- Code / Diagram ---</w:t>
+        <w:t>--- Code Block ---</w:t>
       </w:r>
     </w:p>
     <w:p>
@@ -4479,7 +4054,7 @@
         <w:rPr>
           <w:i/>
         </w:rPr>
-        <w:t>--- End of Code Block ---</w:t>
+        <w:t>------------------</w:t>
       </w:r>
     </w:p>
     <w:p>
@@ -5308,7 +4883,7 @@
         <w:rPr>
           <w:i/>
         </w:rPr>
-        <w:t>--- Code / Diagram ---</w:t>
+        <w:t>--- Code Block ---</w:t>
       </w:r>
     </w:p>
     <w:p>
@@ -5520,7 +5095,7 @@
         <w:rPr>
           <w:i/>
         </w:rPr>
-        <w:t>--- End of Code Block ---</w:t>
+        <w:t>------------------</w:t>
       </w:r>
     </w:p>
     <w:p>
@@ -5541,7 +5116,7 @@
         <w:rPr>
           <w:i/>
         </w:rPr>
-        <w:t>--- Code / Diagram ---</w:t>
+        <w:t>--- Code Block ---</w:t>
       </w:r>
     </w:p>
     <w:p>
@@ -5749,7 +5324,7 @@
         <w:rPr>
           <w:i/>
         </w:rPr>
-        <w:t>--- End of Code Block ---</w:t>
+        <w:t>------------------</w:t>
       </w:r>
     </w:p>
     <w:p>

</xml_diff>